<commit_message>
Eski qo'llanmalarda baholash fan dasturidagi 0–2 ballga o'tkazildi
- 5 ballik jadvallar (A01-A02, A03–A05, A07–A09, A11, A12, A19, A22): 5 → 2 (A'lo),
  4 va 3 → 1 (Qoniqarli, ikkala daraja matni saqlangan), 2 → 0 (Qoniqarsiz);
  JB qoidasi haqida izoh qo'shildi
- A06, A10: bo'lim ballari ulushga (%) aylantirildi va 0–2 ballga o'tkazish jadvali qo'shildi

Co-Authored-By: Claude Opus 5.5 <noreply@anthropic.com>
Claude-Session: https://claude.ai/code/session_01211J4GhAPU473avPFqaNRY
</commit_message>
<xml_diff>
--- a/A01-A02/A01-A02 - Blokcheynning ishlash tamoyillarini simulyatsiya qilish va SHA-256 xesh funksiyasini tahlil qilish.docx
+++ b/A01-A02/A01-A02 - Blokcheynning ishlash tamoyillarini simulyatsiya qilish va SHA-256 xesh funksiyasini tahlil qilish.docx
@@ -5783,7 +5783,7 @@
           <w:sz w:val="22"/>
           <w:szCs w:val="22"/>
         </w:rPr>
-        <w:t xml:space="preserve">Har bir mashg'ulot 5 ballik tizimda baholanadi. Ikkala mashg'ulotning o'rtacha bahosi joriy nazorat ballariga qo'shiladi.</w:t>
+        <w:t>Fan dasturiga muvofiq A1 va A2 alohida amaliy ishlar: har biri quyidagi mezonlar bo'yicha 0–2 ball bilan baholanadi; A1–A23 ishlaridan eng yuqori 10 ta natija joriy bahoga (JB, 20 ball) kiradi.</w:t>
       </w:r>
     </w:p>
     <w:tbl>
@@ -5928,7 +5928,7 @@
                 <w:sz w:val="19"/>
                 <w:szCs w:val="19"/>
               </w:rPr>
-              <w:t xml:space="preserve">5</w:t>
+              <w:t>2</w:t>
             </w:r>
           </w:p>
         </w:tc>
@@ -5958,7 +5958,7 @@
                 <w:sz w:val="19"/>
                 <w:szCs w:val="19"/>
               </w:rPr>
-              <w:t xml:space="preserve">A'lo</w:t>
+              <w:t>A'lo</w:t>
             </w:r>
           </w:p>
         </w:tc>
@@ -6021,7 +6021,7 @@
                 <w:sz w:val="19"/>
                 <w:szCs w:val="19"/>
               </w:rPr>
-              <w:t xml:space="preserve">4</w:t>
+              <w:t>1</w:t>
             </w:r>
           </w:p>
         </w:tc>
@@ -6052,7 +6052,7 @@
                 <w:sz w:val="19"/>
                 <w:szCs w:val="19"/>
               </w:rPr>
-              <w:t xml:space="preserve">Yaxshi</w:t>
+              <w:t>Qoniqarli</w:t>
             </w:r>
           </w:p>
         </w:tc>
@@ -6083,7 +6083,7 @@
                 <w:sz w:val="19"/>
                 <w:szCs w:val="19"/>
               </w:rPr>
-              <w:t xml:space="preserve">Barcha topshiriqlar bajarilgan, hisobotda kichik kamchiliklar bor, savollarning ko'pchiligiga javob berilgan</w:t>
+              <w:t>Barcha topshiriqlar bajarilgan, hisobotda kichik kamchiliklar bor, savollarning ko'pchiligiga javob berilgan; yoki kamida: topshiriqlarning kamida yarmi bajarilgan, asosiy tushunchalar o'zlashtirilgan</w:t>
             </w:r>
           </w:p>
         </w:tc>
@@ -6092,6 +6092,7 @@
         <w:tc>
           <w:tcPr>
             <w:tcW w:type="dxa" w:w="1300"/>
+            <w:shd w:fill="F2F5FB" w:color="auto" w:val="clear"/>
             <w:tcMar>
               <w:top w:type="dxa" w:w="70"/>
               <w:left w:type="dxa" w:w="100"/>
@@ -6115,100 +6116,7 @@
                 <w:sz w:val="19"/>
                 <w:szCs w:val="19"/>
               </w:rPr>
-              <w:t xml:space="preserve">3</w:t>
-            </w:r>
-          </w:p>
-        </w:tc>
-        <w:tc>
-          <w:tcPr>
-            <w:tcW w:type="dxa" w:w="2600"/>
-            <w:tcMar>
-              <w:top w:type="dxa" w:w="70"/>
-              <w:left w:type="dxa" w:w="100"/>
-              <w:bottom w:type="dxa" w:w="70"/>
-              <w:right w:type="dxa" w:w="100"/>
-            </w:tcMar>
-          </w:tcPr>
-          <w:p>
-            <w:pPr>
-              <w:spacing w:after="0" w:before="0" w:line="270"/>
-              <w:jc w:val="left"/>
-            </w:pPr>
-            <w:r>
-              <w:rPr>
-                <w:rFonts w:ascii="Times New Roman" w:cs="Times New Roman" w:eastAsia="Times New Roman" w:hAnsi="Times New Roman"/>
-                <w:b w:val="false"/>
-                <w:bCs w:val="false"/>
-                <w:i w:val="false"/>
-                <w:iCs w:val="false"/>
-                <w:color w:val="000000"/>
-                <w:sz w:val="19"/>
-                <w:szCs w:val="19"/>
-              </w:rPr>
-              <w:t xml:space="preserve">Qoniqarli</w:t>
-            </w:r>
-          </w:p>
-        </w:tc>
-        <w:tc>
-          <w:tcPr>
-            <w:tcW w:type="dxa" w:w="6000"/>
-            <w:tcMar>
-              <w:top w:type="dxa" w:w="70"/>
-              <w:left w:type="dxa" w:w="100"/>
-              <w:bottom w:type="dxa" w:w="70"/>
-              <w:right w:type="dxa" w:w="100"/>
-            </w:tcMar>
-          </w:tcPr>
-          <w:p>
-            <w:pPr>
-              <w:spacing w:after="0" w:before="0" w:line="270"/>
-              <w:jc w:val="left"/>
-            </w:pPr>
-            <w:r>
-              <w:rPr>
-                <w:rFonts w:ascii="Times New Roman" w:cs="Times New Roman" w:eastAsia="Times New Roman" w:hAnsi="Times New Roman"/>
-                <w:b w:val="false"/>
-                <w:bCs w:val="false"/>
-                <w:i w:val="false"/>
-                <w:iCs w:val="false"/>
-                <w:color w:val="000000"/>
-                <w:sz w:val="19"/>
-                <w:szCs w:val="19"/>
-              </w:rPr>
-              <w:t xml:space="preserve">Topshiriqlarning kamida yarmi bajarilgan, asosiy tushunchalar o'zlashtirilgan</w:t>
-            </w:r>
-          </w:p>
-        </w:tc>
-      </w:tr>
-      <w:tr>
-        <w:tc>
-          <w:tcPr>
-            <w:tcW w:type="dxa" w:w="1300"/>
-            <w:shd w:fill="F2F5FB" w:color="auto" w:val="clear"/>
-            <w:tcMar>
-              <w:top w:type="dxa" w:w="70"/>
-              <w:left w:type="dxa" w:w="100"/>
-              <w:bottom w:type="dxa" w:w="70"/>
-              <w:right w:type="dxa" w:w="100"/>
-            </w:tcMar>
-          </w:tcPr>
-          <w:p>
-            <w:pPr>
-              <w:spacing w:after="0" w:before="0" w:line="270"/>
-              <w:jc w:val="left"/>
-            </w:pPr>
-            <w:r>
-              <w:rPr>
-                <w:rFonts w:ascii="Times New Roman" w:cs="Times New Roman" w:eastAsia="Times New Roman" w:hAnsi="Times New Roman"/>
-                <w:b w:val="false"/>
-                <w:bCs w:val="false"/>
-                <w:i w:val="false"/>
-                <w:iCs w:val="false"/>
-                <w:color w:val="000000"/>
-                <w:sz w:val="19"/>
-                <w:szCs w:val="19"/>
-              </w:rPr>
-              <w:t xml:space="preserve">2</w:t>
+              <w:t>0</w:t>
             </w:r>
           </w:p>
         </w:tc>

</xml_diff>